<commit_message>
Finalize help docs, screenshot automation, and role manuals
</commit_message>
<xml_diff>
--- a/docs/USER_MANUAL_v2.docx
+++ b/docs/USER_MANUAL_v2.docx
@@ -5,6 +5,7 @@
     <w:p>
       <w:pPr>
         <w:pStyle w:val="Heading1"/>
+        <w:spacing w:before="240" w:after="120"/>
       </w:pPr>
       <w:r>
         <w:t xml:space="preserve">AuthenticQR User Manual</w:t>
@@ -16,16 +17,25 @@
       </w:r>
     </w:p>
     <w:p>
+      <w:pPr>
+        <w:spacing w:after="80"/>
+      </w:pPr>
       <w:r>
         <w:t xml:space="preserve">Version: 2.0</w:t>
       </w:r>
     </w:p>
     <w:p>
+      <w:pPr>
+        <w:spacing w:after="80"/>
+      </w:pPr>
       <w:r>
         <w:t xml:space="preserve">Audience: Super Admin, Licensee/Admin, Manufacturer, Customer (scanner/verify page)</w:t>
       </w:r>
     </w:p>
     <w:p>
+      <w:pPr>
+        <w:spacing w:after="80"/>
+      </w:pPr>
       <w:r>
         <w:t xml:space="preserve">Last Updated: 2026-02-15</w:t>
       </w:r>
@@ -38,12 +48,16 @@
     <w:p>
       <w:pPr>
         <w:pStyle w:val="Heading2"/>
+        <w:spacing w:before="220" w:after="100"/>
       </w:pPr>
       <w:r>
         <w:t xml:space="preserve">1. Purpose</w:t>
       </w:r>
     </w:p>
     <w:p>
+      <w:pPr>
+        <w:spacing w:after="80"/>
+      </w:pPr>
       <w:r>
         <w:t xml:space="preserve">This manual explains how to operate AuthenticQR end-to-end:</w:t>
       </w:r>
@@ -55,6 +69,7 @@
           <w:ilvl w:val="0"/>
           <w:numId w:val="1"/>
         </w:numPr>
+        <w:spacing w:after="60"/>
       </w:pPr>
       <w:r>
         <w:t xml:space="preserve">Creating and managing tenants (licensees/organizations)</w:t>
@@ -67,6 +82,7 @@
           <w:ilvl w:val="0"/>
           <w:numId w:val="1"/>
         </w:numPr>
+        <w:spacing w:after="60"/>
       </w:pPr>
       <w:r>
         <w:t xml:space="preserve">QR inventory requests and allocations</w:t>
@@ -79,6 +95,7 @@
           <w:ilvl w:val="0"/>
           <w:numId w:val="1"/>
         </w:numPr>
+        <w:spacing w:after="60"/>
       </w:pPr>
       <w:r>
         <w:t xml:space="preserve">Manufacturer printing workflow (secure print packs)</w:t>
@@ -91,6 +108,7 @@
           <w:ilvl w:val="0"/>
           <w:numId w:val="1"/>
         </w:numPr>
+        <w:spacing w:after="60"/>
       </w:pPr>
       <w:r>
         <w:t xml:space="preserve">Customer verification outcomes (including legitimate repeat scans)</w:t>
@@ -103,6 +121,7 @@
           <w:ilvl w:val="0"/>
           <w:numId w:val="1"/>
         </w:numPr>
+        <w:spacing w:after="60"/>
       </w:pPr>
       <w:r>
         <w:t xml:space="preserve">Incident Response (IR): alerts, incidents, containment actions, and communications</w:t>
@@ -114,6 +133,9 @@
       </w:r>
     </w:p>
     <w:p>
+      <w:pPr>
+        <w:spacing w:after="80"/>
+      </w:pPr>
       <w:r>
         <w:t xml:space="preserve">AuthenticQR is designed for anti-counterfeit control:</w:t>
       </w:r>
@@ -125,6 +147,7 @@
           <w:ilvl w:val="0"/>
           <w:numId w:val="1"/>
         </w:numPr>
+        <w:spacing w:after="60"/>
       </w:pPr>
       <w:r>
         <w:t xml:space="preserve">Licensees receive QR inventory.</w:t>
@@ -137,6 +160,7 @@
           <w:ilvl w:val="0"/>
           <w:numId w:val="1"/>
         </w:numPr>
+        <w:spacing w:after="60"/>
       </w:pPr>
       <w:r>
         <w:t xml:space="preserve">Licensees assign quantities to manufacturers.</w:t>
@@ -149,6 +173,7 @@
           <w:ilvl w:val="0"/>
           <w:numId w:val="1"/>
         </w:numPr>
+        <w:spacing w:after="60"/>
       </w:pPr>
       <w:r>
         <w:t xml:space="preserve">Manufacturers print using server-issued tokens.</w:t>
@@ -161,6 +186,7 @@
           <w:ilvl w:val="0"/>
           <w:numId w:val="1"/>
         </w:numPr>
+        <w:spacing w:after="60"/>
       </w:pPr>
       <w:r>
         <w:t xml:space="preserve">Customers verify authenticity via the public verify page.</w:t>
@@ -173,6 +199,7 @@
           <w:ilvl w:val="0"/>
           <w:numId w:val="1"/>
         </w:numPr>
+        <w:spacing w:after="60"/>
       </w:pPr>
       <w:r>
         <w:t xml:space="preserve">Policy alerts and incidents help detect duplicate labels and contain issues.</w:t>
@@ -186,6 +213,7 @@
     <w:p>
       <w:pPr>
         <w:pStyle w:val="Heading2"/>
+        <w:spacing w:before="220" w:after="100"/>
       </w:pPr>
       <w:r>
         <w:t xml:space="preserve">2. Role Access</w:t>
@@ -199,6 +227,7 @@
     <w:p>
       <w:pPr>
         <w:pStyle w:val="Heading3"/>
+        <w:spacing w:before="180" w:after="80"/>
       </w:pPr>
       <w:r>
         <w:t xml:space="preserve">2.1 Getting access (invite-based onboarding)</w:t>
@@ -210,6 +239,9 @@
       </w:r>
     </w:p>
     <w:p>
+      <w:pPr>
+        <w:spacing w:after="80"/>
+      </w:pPr>
       <w:r>
         <w:t xml:space="preserve">#### Super Admin</w:t>
       </w:r>
@@ -221,6 +253,7 @@
           <w:ilvl w:val="0"/>
           <w:numId w:val="1"/>
         </w:numPr>
+        <w:spacing w:after="60"/>
       </w:pPr>
       <w:r>
         <w:t xml:space="preserve">Provisioned by the platform owner (no self sign-up).</w:t>
@@ -233,6 +266,7 @@
           <w:ilvl w:val="0"/>
           <w:numId w:val="1"/>
         </w:numPr>
+        <w:spacing w:after="60"/>
       </w:pPr>
       <w:r>
         <w:t xml:space="preserve">Full platform access.</w:t>
@@ -244,6 +278,9 @@
       </w:r>
     </w:p>
     <w:p>
+      <w:pPr>
+        <w:spacing w:after="80"/>
+      </w:pPr>
       <w:r>
         <w:t xml:space="preserve">#### Licensee/Admin (brand/company)</w:t>
       </w:r>
@@ -255,6 +292,7 @@
           <w:ilvl w:val="0"/>
           <w:numId w:val="1"/>
         </w:numPr>
+        <w:spacing w:after="60"/>
       </w:pPr>
       <w:r>
         <w:t xml:space="preserve">Created and invited by Super Admin (or an org admin).</w:t>
@@ -267,6 +305,7 @@
           <w:ilvl w:val="0"/>
           <w:numId w:val="1"/>
         </w:numPr>
+        <w:spacing w:after="60"/>
       </w:pPr>
       <w:r>
         <w:t xml:space="preserve">Scoped to exactly one organization (tenant).</w:t>
@@ -279,6 +318,7 @@
           <w:ilvl w:val="0"/>
           <w:numId w:val="1"/>
         </w:numPr>
+        <w:spacing w:after="60"/>
       </w:pPr>
       <w:r>
         <w:t xml:space="preserve">Can only see licensee/manufacturer data within that org.</w:t>
@@ -290,6 +330,9 @@
       </w:r>
     </w:p>
     <w:p>
+      <w:pPr>
+        <w:spacing w:after="80"/>
+      </w:pPr>
       <w:r>
         <w:t xml:space="preserve">#### Manufacturer (factory user)</w:t>
       </w:r>
@@ -301,6 +344,7 @@
           <w:ilvl w:val="0"/>
           <w:numId w:val="1"/>
         </w:numPr>
+        <w:spacing w:after="60"/>
       </w:pPr>
       <w:r>
         <w:t xml:space="preserve">Invited by Licensee/Admin (or Super Admin).</w:t>
@@ -313,6 +357,7 @@
           <w:ilvl w:val="0"/>
           <w:numId w:val="1"/>
         </w:numPr>
+        <w:spacing w:after="60"/>
       </w:pPr>
       <w:r>
         <w:t xml:space="preserve">Scoped to assigned batches only.</w:t>
@@ -324,6 +369,9 @@
       </w:r>
     </w:p>
     <w:p>
+      <w:pPr>
+        <w:spacing w:after="80"/>
+      </w:pPr>
       <w:r>
         <w:t xml:space="preserve">#### Customer (scanner / verification page)</w:t>
       </w:r>
@@ -335,6 +383,7 @@
           <w:ilvl w:val="0"/>
           <w:numId w:val="1"/>
         </w:numPr>
+        <w:spacing w:after="60"/>
       </w:pPr>
       <w:r>
         <w:t xml:space="preserve">No account required.</w:t>
@@ -347,6 +396,7 @@
           <w:ilvl w:val="0"/>
           <w:numId w:val="1"/>
         </w:numPr>
+        <w:spacing w:after="60"/>
       </w:pPr>
       <w:r>
         <w:t xml:space="preserve">Access is via scanning a product QR or entering a code on the verify page.</w:t>
@@ -360,12 +410,16 @@
     <w:p>
       <w:pPr>
         <w:pStyle w:val="Heading3"/>
+        <w:spacing w:before="180" w:after="80"/>
       </w:pPr>
       <w:r>
         <w:t xml:space="preserve">2.2 Setting or resetting password</w:t>
       </w:r>
     </w:p>
     <w:p>
+      <w:pPr>
+        <w:spacing w:after="80"/>
+      </w:pPr>
       <w:r>
         <w:t xml:space="preserve">Applies to Super Admin, Licensee/Admin, and Manufacturer users:</w:t>
       </w:r>
@@ -377,6 +431,7 @@
           <w:ilvl w:val="0"/>
           <w:numId w:val="1"/>
         </w:numPr>
+        <w:spacing w:after="60"/>
       </w:pPr>
       <w:r>
         <w:t xml:space="preserve">First-time password: accept the invite link and set a password.</w:t>
@@ -389,6 +444,7 @@
           <w:ilvl w:val="0"/>
           <w:numId w:val="1"/>
         </w:numPr>
+        <w:spacing w:after="60"/>
       </w:pPr>
       <w:r>
         <w:t xml:space="preserve">Forgot password: use the “Forgot password?” link from the login page.</w:t>
@@ -400,6 +456,9 @@
       </w:r>
     </w:p>
     <w:p>
+      <w:pPr>
+        <w:spacing w:after="80"/>
+      </w:pPr>
       <w:r>
         <w:t xml:space="preserve">Customers do not set a password (public flow).</w:t>
       </w:r>
@@ -412,6 +471,7 @@
     <w:p>
       <w:pPr>
         <w:pStyle w:val="Heading2"/>
+        <w:spacing w:before="220" w:after="100"/>
       </w:pPr>
       <w:r>
         <w:t xml:space="preserve">3. Core Data Rules</w:t>
@@ -423,26 +483,41 @@
       </w:r>
     </w:p>
     <w:p>
+      <w:pPr>
+        <w:spacing w:after="60"/>
+      </w:pPr>
       <w:r>
         <w:t xml:space="preserve">1. QR inventory is allocated by quantity and follows the next available sequence.</w:t>
       </w:r>
     </w:p>
     <w:p>
+      <w:pPr>
+        <w:spacing w:after="60"/>
+      </w:pPr>
       <w:r>
         <w:t xml:space="preserve">2. Overlapping allocations are prevented server-side.</w:t>
       </w:r>
     </w:p>
     <w:p>
+      <w:pPr>
+        <w:spacing w:after="60"/>
+      </w:pPr>
       <w:r>
         <w:t xml:space="preserve">3. Manufacturers print using server-generated, signed QR tokens inside a print ZIP pack.</w:t>
       </w:r>
     </w:p>
     <w:p>
+      <w:pPr>
+        <w:spacing w:after="60"/>
+      </w:pPr>
       <w:r>
         <w:t xml:space="preserve">4. First customer verification is authentic when the QR is printed and valid.</w:t>
       </w:r>
     </w:p>
     <w:p>
+      <w:pPr>
+        <w:spacing w:after="60"/>
+      </w:pPr>
       <w:r>
         <w:t xml:space="preserve">5. Repeat customer verifications are normal and remain authentic unless policy/containment flags the code.</w:t>
       </w:r>
@@ -455,6 +530,7 @@
     <w:p>
       <w:pPr>
         <w:pStyle w:val="Heading2"/>
+        <w:spacing w:before="220" w:after="100"/>
       </w:pPr>
       <w:r>
         <w:t xml:space="preserve">4. Super Admin Guide</w:t>
@@ -468,22 +544,32 @@
     <w:p>
       <w:pPr>
         <w:pStyle w:val="Heading3"/>
+        <w:spacing w:before="180" w:after="80"/>
       </w:pPr>
       <w:r>
         <w:t xml:space="preserve">4.1 Login</w:t>
       </w:r>
     </w:p>
     <w:p>
+      <w:pPr>
+        <w:spacing w:after="60"/>
+      </w:pPr>
       <w:r>
         <w:t xml:space="preserve">1. Open the web app URL.</w:t>
       </w:r>
     </w:p>
     <w:p>
+      <w:pPr>
+        <w:spacing w:after="60"/>
+      </w:pPr>
       <w:r>
         <w:t xml:space="preserve">2. Sign in with Super Admin email and password.</w:t>
       </w:r>
     </w:p>
     <w:p>
+      <w:pPr>
+        <w:spacing w:after="60"/>
+      </w:pPr>
       <w:r>
         <w:t xml:space="preserve">3. Confirm left navigation includes Licensees, QR Requests, and IR Center.</w:t>
       </w:r>
@@ -496,12 +582,16 @@
     <w:p>
       <w:pPr>
         <w:pStyle w:val="Heading3"/>
+        <w:spacing w:before="180" w:after="80"/>
       </w:pPr>
       <w:r>
         <w:t xml:space="preserve">4.2 Create a licensee (tenant)</w:t>
       </w:r>
     </w:p>
     <w:p>
+      <w:pPr>
+        <w:spacing w:after="80"/>
+      </w:pPr>
       <w:r>
         <w:t xml:space="preserve">Path: Licensees</w:t>
       </w:r>
@@ -512,16 +602,25 @@
       </w:r>
     </w:p>
     <w:p>
+      <w:pPr>
+        <w:spacing w:after="60"/>
+      </w:pPr>
       <w:r>
         <w:t xml:space="preserve">1. Select Add Licensee.</w:t>
       </w:r>
     </w:p>
     <w:p>
+      <w:pPr>
+        <w:spacing w:after="60"/>
+      </w:pPr>
       <w:r>
         <w:t xml:space="preserve">2. Fill the licensee/company details.</w:t>
       </w:r>
     </w:p>
     <w:p>
+      <w:pPr>
+        <w:spacing w:after="60"/>
+      </w:pPr>
       <w:r>
         <w:t xml:space="preserve">3. Create the licensee.</w:t>
       </w:r>
@@ -534,12 +633,16 @@
     <w:p>
       <w:pPr>
         <w:pStyle w:val="Heading3"/>
+        <w:spacing w:before="180" w:after="80"/>
       </w:pPr>
       <w:r>
         <w:t xml:space="preserve">4.3 Approve QR inventory requests</w:t>
       </w:r>
     </w:p>
     <w:p>
+      <w:pPr>
+        <w:spacing w:after="80"/>
+      </w:pPr>
       <w:r>
         <w:t xml:space="preserve">Path: QR Requests</w:t>
       </w:r>
@@ -550,11 +653,17 @@
       </w:r>
     </w:p>
     <w:p>
+      <w:pPr>
+        <w:spacing w:after="60"/>
+      </w:pPr>
       <w:r>
         <w:t xml:space="preserve">1. Filter to pending requests.</w:t>
       </w:r>
     </w:p>
     <w:p>
+      <w:pPr>
+        <w:spacing w:after="60"/>
+      </w:pPr>
       <w:r>
         <w:t xml:space="preserve">2. Approve or reject.</w:t>
       </w:r>
@@ -565,6 +674,9 @@
       </w:r>
     </w:p>
     <w:p>
+      <w:pPr>
+        <w:spacing w:after="80"/>
+      </w:pPr>
       <w:r>
         <w:t xml:space="preserve">Expected behavior:</w:t>
       </w:r>
@@ -576,6 +688,7 @@
           <w:ilvl w:val="0"/>
           <w:numId w:val="1"/>
         </w:numPr>
+        <w:spacing w:after="60"/>
       </w:pPr>
       <w:r>
         <w:t xml:space="preserve">Approvals allocate the next available QR sequence automatically.</w:t>
@@ -588,6 +701,7 @@
           <w:ilvl w:val="0"/>
           <w:numId w:val="1"/>
         </w:numPr>
+        <w:spacing w:after="60"/>
       </w:pPr>
       <w:r>
         <w:t xml:space="preserve">Rejections keep inventory unchanged.</w:t>
@@ -601,12 +715,16 @@
     <w:p>
       <w:pPr>
         <w:pStyle w:val="Heading3"/>
+        <w:spacing w:before="180" w:after="80"/>
       </w:pPr>
       <w:r>
         <w:t xml:space="preserve">4.4 Incident Response (IR Center)</w:t>
       </w:r>
     </w:p>
     <w:p>
+      <w:pPr>
+        <w:spacing w:after="80"/>
+      </w:pPr>
       <w:r>
         <w:t xml:space="preserve">Path: IR Center</w:t>
       </w:r>
@@ -617,6 +735,9 @@
       </w:r>
     </w:p>
     <w:p>
+      <w:pPr>
+        <w:spacing w:after="80"/>
+      </w:pPr>
       <w:r>
         <w:t xml:space="preserve">Use IR Center to:</w:t>
       </w:r>
@@ -628,6 +749,7 @@
           <w:ilvl w:val="0"/>
           <w:numId w:val="1"/>
         </w:numPr>
+        <w:spacing w:after="60"/>
       </w:pPr>
       <w:r>
         <w:t xml:space="preserve">Review policy alerts (anomaly detection)</w:t>
@@ -640,6 +762,7 @@
           <w:ilvl w:val="0"/>
           <w:numId w:val="1"/>
         </w:numPr>
+        <w:spacing w:after="60"/>
       </w:pPr>
       <w:r>
         <w:t xml:space="preserve">Create and manage incidents</w:t>
@@ -652,6 +775,7 @@
           <w:ilvl w:val="0"/>
           <w:numId w:val="1"/>
         </w:numPr>
+        <w:spacing w:after="60"/>
       </w:pPr>
       <w:r>
         <w:t xml:space="preserve">Apply containment actions (reversible)</w:t>
@@ -664,6 +788,7 @@
           <w:ilvl w:val="0"/>
           <w:numId w:val="1"/>
         </w:numPr>
+        <w:spacing w:after="60"/>
       </w:pPr>
       <w:r>
         <w:t xml:space="preserve">Send emails to reporters/org admins</w:t>
@@ -676,6 +801,7 @@
           <w:ilvl w:val="0"/>
           <w:numId w:val="1"/>
         </w:numPr>
+        <w:spacing w:after="60"/>
       </w:pPr>
       <w:r>
         <w:t xml:space="preserve">Upload evidence/attachments (if enabled)</w:t>
@@ -689,6 +815,7 @@
     <w:p>
       <w:pPr>
         <w:pStyle w:val="Heading2"/>
+        <w:spacing w:before="220" w:after="100"/>
       </w:pPr>
       <w:r>
         <w:t xml:space="preserve">5. Licensee/Admin Guide</w:t>
@@ -702,22 +829,32 @@
     <w:p>
       <w:pPr>
         <w:pStyle w:val="Heading3"/>
+        <w:spacing w:before="180" w:after="80"/>
       </w:pPr>
       <w:r>
         <w:t xml:space="preserve">5.1 Login</w:t>
       </w:r>
     </w:p>
     <w:p>
+      <w:pPr>
+        <w:spacing w:after="60"/>
+      </w:pPr>
       <w:r>
         <w:t xml:space="preserve">1. Open the web app URL.</w:t>
       </w:r>
     </w:p>
     <w:p>
+      <w:pPr>
+        <w:spacing w:after="60"/>
+      </w:pPr>
       <w:r>
         <w:t xml:space="preserve">2. Sign in with your licensee admin email and password.</w:t>
       </w:r>
     </w:p>
     <w:p>
+      <w:pPr>
+        <w:spacing w:after="60"/>
+      </w:pPr>
       <w:r>
         <w:t xml:space="preserve">3. Confirm navigation includes QR Requests, Batches, Manufacturers, QR Tracking, Audit Logs.</w:t>
       </w:r>
@@ -728,6 +865,9 @@
       </w:r>
     </w:p>
     <w:p>
+      <w:pPr>
+        <w:spacing w:after="80"/>
+      </w:pPr>
       <w:r>
         <w:t xml:space="preserve">Expected behavior:</w:t>
       </w:r>
@@ -739,6 +879,7 @@
           <w:ilvl w:val="0"/>
           <w:numId w:val="1"/>
         </w:numPr>
+        <w:spacing w:after="60"/>
       </w:pPr>
       <w:r>
         <w:t xml:space="preserve">You only see data within your licensee/org scope.</w:t>
@@ -752,12 +893,16 @@
     <w:p>
       <w:pPr>
         <w:pStyle w:val="Heading3"/>
+        <w:spacing w:before="180" w:after="80"/>
       </w:pPr>
       <w:r>
         <w:t xml:space="preserve">5.2 Manufacturers (invite factory users)</w:t>
       </w:r>
     </w:p>
     <w:p>
+      <w:pPr>
+        <w:spacing w:after="80"/>
+      </w:pPr>
       <w:r>
         <w:t xml:space="preserve">Path: Manufacturers</w:t>
       </w:r>
@@ -768,16 +913,25 @@
       </w:r>
     </w:p>
     <w:p>
+      <w:pPr>
+        <w:spacing w:after="60"/>
+      </w:pPr>
       <w:r>
         <w:t xml:space="preserve">1. Select Add Manufacturer.</w:t>
       </w:r>
     </w:p>
     <w:p>
+      <w:pPr>
+        <w:spacing w:after="60"/>
+      </w:pPr>
       <w:r>
         <w:t xml:space="preserve">2. Fill name and email.</w:t>
       </w:r>
     </w:p>
     <w:p>
+      <w:pPr>
+        <w:spacing w:after="60"/>
+      </w:pPr>
       <w:r>
         <w:t xml:space="preserve">3. Use Invite (recommended) to email a one-time link.</w:t>
       </w:r>
@@ -788,6 +942,9 @@
       </w:r>
     </w:p>
     <w:p>
+      <w:pPr>
+        <w:spacing w:after="80"/>
+      </w:pPr>
       <w:r>
         <w:t xml:space="preserve">Notes:</w:t>
       </w:r>
@@ -799,6 +956,7 @@
           <w:ilvl w:val="0"/>
           <w:numId w:val="1"/>
         </w:numPr>
+        <w:spacing w:after="60"/>
       </w:pPr>
       <w:r>
         <w:t xml:space="preserve">Invites expire after 24 hours.</w:t>
@@ -811,6 +969,7 @@
           <w:ilvl w:val="0"/>
           <w:numId w:val="1"/>
         </w:numPr>
+        <w:spacing w:after="60"/>
       </w:pPr>
       <w:r>
         <w:t xml:space="preserve">If email delivery is not configured, the invite still exists in the database but the user will not receive it.</w:t>
@@ -824,12 +983,16 @@
     <w:p>
       <w:pPr>
         <w:pStyle w:val="Heading3"/>
+        <w:spacing w:before="180" w:after="80"/>
       </w:pPr>
       <w:r>
         <w:t xml:space="preserve">5.3 Request new QR inventory</w:t>
       </w:r>
     </w:p>
     <w:p>
+      <w:pPr>
+        <w:spacing w:after="80"/>
+      </w:pPr>
       <w:r>
         <w:t xml:space="preserve">Path: QR Requests</w:t>
       </w:r>
@@ -840,21 +1003,33 @@
       </w:r>
     </w:p>
     <w:p>
+      <w:pPr>
+        <w:spacing w:after="80"/>
+      </w:pPr>
       <w:r>
         <w:t xml:space="preserve">Actions:</w:t>
       </w:r>
     </w:p>
     <w:p>
+      <w:pPr>
+        <w:spacing w:after="60"/>
+      </w:pPr>
       <w:r>
         <w:t xml:space="preserve">1. Enter Quantity.</w:t>
       </w:r>
     </w:p>
     <w:p>
+      <w:pPr>
+        <w:spacing w:after="60"/>
+      </w:pPr>
       <w:r>
         <w:t xml:space="preserve">2. Optionally add a request note.</w:t>
       </w:r>
     </w:p>
     <w:p>
+      <w:pPr>
+        <w:spacing w:after="60"/>
+      </w:pPr>
       <w:r>
         <w:t xml:space="preserve">3. Click Submit Request.</w:t>
       </w:r>
@@ -865,21 +1040,33 @@
       </w:r>
     </w:p>
     <w:p>
+      <w:pPr>
+        <w:spacing w:after="80"/>
+      </w:pPr>
       <w:r>
         <w:t xml:space="preserve">Approval flow:</w:t>
       </w:r>
     </w:p>
     <w:p>
+      <w:pPr>
+        <w:spacing w:after="60"/>
+      </w:pPr>
       <w:r>
         <w:t xml:space="preserve">1. Super Admin approves request.</w:t>
       </w:r>
     </w:p>
     <w:p>
+      <w:pPr>
+        <w:spacing w:after="60"/>
+      </w:pPr>
       <w:r>
         <w:t xml:space="preserve">2. Backend allocates next available sequence automatically.</w:t>
       </w:r>
     </w:p>
     <w:p>
+      <w:pPr>
+        <w:spacing w:after="60"/>
+      </w:pPr>
       <w:r>
         <w:t xml:space="preserve">3. New allocation appears as a received batch in your Batches page.</w:t>
       </w:r>
@@ -892,12 +1079,16 @@
     <w:p>
       <w:pPr>
         <w:pStyle w:val="Heading3"/>
+        <w:spacing w:before="180" w:after="80"/>
       </w:pPr>
       <w:r>
         <w:t xml:space="preserve">5.4 Assign received batches to manufacturer</w:t>
       </w:r>
     </w:p>
     <w:p>
+      <w:pPr>
+        <w:spacing w:after="80"/>
+      </w:pPr>
       <w:r>
         <w:t xml:space="preserve">Path: Batches</w:t>
       </w:r>
@@ -908,31 +1099,49 @@
       </w:r>
     </w:p>
     <w:p>
+      <w:pPr>
+        <w:spacing w:after="80"/>
+      </w:pPr>
       <w:r>
         <w:t xml:space="preserve">Actions:</w:t>
       </w:r>
     </w:p>
     <w:p>
+      <w:pPr>
+        <w:spacing w:after="60"/>
+      </w:pPr>
       <w:r>
         <w:t xml:space="preserve">1. Find an unassigned received batch.</w:t>
       </w:r>
     </w:p>
     <w:p>
+      <w:pPr>
+        <w:spacing w:after="60"/>
+      </w:pPr>
       <w:r>
         <w:t xml:space="preserve">2. Open Assign Manufacturer.</w:t>
       </w:r>
     </w:p>
     <w:p>
+      <w:pPr>
+        <w:spacing w:after="60"/>
+      </w:pPr>
       <w:r>
         <w:t xml:space="preserve">3. Select manufacturer.</w:t>
       </w:r>
     </w:p>
     <w:p>
+      <w:pPr>
+        <w:spacing w:after="60"/>
+      </w:pPr>
       <w:r>
         <w:t xml:space="preserve">4. Enter quantity.</w:t>
       </w:r>
     </w:p>
     <w:p>
+      <w:pPr>
+        <w:spacing w:after="60"/>
+      </w:pPr>
       <w:r>
         <w:t xml:space="preserve">5. Submit.</w:t>
       </w:r>
@@ -943,6 +1152,9 @@
       </w:r>
     </w:p>
     <w:p>
+      <w:pPr>
+        <w:spacing w:after="80"/>
+      </w:pPr>
       <w:r>
         <w:t xml:space="preserve">Allocation behavior:</w:t>
       </w:r>
@@ -954,6 +1166,7 @@
           <w:ilvl w:val="0"/>
           <w:numId w:val="1"/>
         </w:numPr>
+        <w:spacing w:after="60"/>
       </w:pPr>
       <w:r>
         <w:t xml:space="preserve">System always uses the next unassigned QR codes in sequence.</w:t>
@@ -966,6 +1179,7 @@
           <w:ilvl w:val="0"/>
           <w:numId w:val="1"/>
         </w:numPr>
+        <w:spacing w:after="60"/>
       </w:pPr>
       <w:r>
         <w:t xml:space="preserve">No overlap is allowed.</w:t>
@@ -978,6 +1192,7 @@
           <w:ilvl w:val="0"/>
           <w:numId w:val="1"/>
         </w:numPr>
+        <w:spacing w:after="60"/>
       </w:pPr>
       <w:r>
         <w:t xml:space="preserve">Remaining quantity stays available for later assignments.</w:t>
@@ -991,12 +1206,16 @@
     <w:p>
       <w:pPr>
         <w:pStyle w:val="Heading3"/>
+        <w:spacing w:before="180" w:after="80"/>
       </w:pPr>
       <w:r>
         <w:t xml:space="preserve">5.5 Audit logs</w:t>
       </w:r>
     </w:p>
     <w:p>
+      <w:pPr>
+        <w:spacing w:after="80"/>
+      </w:pPr>
       <w:r>
         <w:t xml:space="preserve">Path: Audit Logs</w:t>
       </w:r>
@@ -1007,6 +1226,9 @@
       </w:r>
     </w:p>
     <w:p>
+      <w:pPr>
+        <w:spacing w:after="80"/>
+      </w:pPr>
       <w:r>
         <w:t xml:space="preserve">Scope:</w:t>
       </w:r>
@@ -1018,6 +1240,7 @@
           <w:ilvl w:val="0"/>
           <w:numId w:val="1"/>
         </w:numPr>
+        <w:spacing w:after="60"/>
       </w:pPr>
       <w:r>
         <w:t xml:space="preserve">You see only your licensee activity and your manufacturers’ actions.</w:t>
@@ -1030,6 +1253,7 @@
           <w:ilvl w:val="0"/>
           <w:numId w:val="1"/>
         </w:numPr>
+        <w:spacing w:after="60"/>
       </w:pPr>
       <w:r>
         <w:t xml:space="preserve">Super Admin-only actions for other licensees are not visible in your scope.</w:t>
@@ -1041,6 +1265,9 @@
       </w:r>
     </w:p>
     <w:p>
+      <w:pPr>
+        <w:spacing w:after="80"/>
+      </w:pPr>
       <w:r>
         <w:t xml:space="preserve">Use audit logs for:</w:t>
       </w:r>
@@ -1052,6 +1279,7 @@
           <w:ilvl w:val="0"/>
           <w:numId w:val="1"/>
         </w:numPr>
+        <w:spacing w:after="60"/>
       </w:pPr>
       <w:r>
         <w:t xml:space="preserve">Allocation tracing.</w:t>
@@ -1064,6 +1292,7 @@
           <w:ilvl w:val="0"/>
           <w:numId w:val="1"/>
         </w:numPr>
+        <w:spacing w:after="60"/>
       </w:pPr>
       <w:r>
         <w:t xml:space="preserve">Assignment verification.</w:t>
@@ -1076,6 +1305,7 @@
           <w:ilvl w:val="0"/>
           <w:numId w:val="1"/>
         </w:numPr>
+        <w:spacing w:after="60"/>
       </w:pPr>
       <w:r>
         <w:t xml:space="preserve">Print/download investigation.</w:t>
@@ -1089,6 +1319,7 @@
     <w:p>
       <w:pPr>
         <w:pStyle w:val="Heading2"/>
+        <w:spacing w:before="220" w:after="100"/>
       </w:pPr>
       <w:r>
         <w:t xml:space="preserve">6. Manufacturer Guide</w:t>
@@ -1102,22 +1333,32 @@
     <w:p>
       <w:pPr>
         <w:pStyle w:val="Heading3"/>
+        <w:spacing w:before="180" w:after="80"/>
       </w:pPr>
       <w:r>
         <w:t xml:space="preserve">6.1 Login</w:t>
       </w:r>
     </w:p>
     <w:p>
+      <w:pPr>
+        <w:spacing w:after="60"/>
+      </w:pPr>
       <w:r>
         <w:t xml:space="preserve">1. Open app URL.</w:t>
       </w:r>
     </w:p>
     <w:p>
+      <w:pPr>
+        <w:spacing w:after="60"/>
+      </w:pPr>
       <w:r>
         <w:t xml:space="preserve">2. Sign in with manufacturer credentials.</w:t>
       </w:r>
     </w:p>
     <w:p>
+      <w:pPr>
+        <w:spacing w:after="60"/>
+      </w:pPr>
       <w:r>
         <w:t xml:space="preserve">3. Confirm access to assigned batch operations.</w:t>
       </w:r>
@@ -1130,12 +1371,16 @@
     <w:p>
       <w:pPr>
         <w:pStyle w:val="Heading3"/>
+        <w:spacing w:before="180" w:after="80"/>
       </w:pPr>
       <w:r>
         <w:t xml:space="preserve">6.2 View assigned batches</w:t>
       </w:r>
     </w:p>
     <w:p>
+      <w:pPr>
+        <w:spacing w:after="80"/>
+      </w:pPr>
       <w:r>
         <w:t xml:space="preserve">Path: Batches</w:t>
       </w:r>
@@ -1146,6 +1391,9 @@
       </w:r>
     </w:p>
     <w:p>
+      <w:pPr>
+        <w:spacing w:after="80"/>
+      </w:pPr>
       <w:r>
         <w:t xml:space="preserve">You should see:</w:t>
       </w:r>
@@ -1157,6 +1405,7 @@
           <w:ilvl w:val="0"/>
           <w:numId w:val="1"/>
         </w:numPr>
+        <w:spacing w:after="60"/>
       </w:pPr>
       <w:r>
         <w:t xml:space="preserve">Batches assigned to your manufacturer account only.</w:t>
@@ -1169,6 +1418,7 @@
           <w:ilvl w:val="0"/>
           <w:numId w:val="1"/>
         </w:numPr>
+        <w:spacing w:after="60"/>
       </w:pPr>
       <w:r>
         <w:t xml:space="preserve">Quantity and print status indicators.</w:t>
@@ -1182,27 +1432,40 @@
     <w:p>
       <w:pPr>
         <w:pStyle w:val="Heading3"/>
+        <w:spacing w:before="180" w:after="80"/>
       </w:pPr>
       <w:r>
         <w:t xml:space="preserve">6.3 Create print job</w:t>
       </w:r>
     </w:p>
     <w:p>
+      <w:pPr>
+        <w:spacing w:after="60"/>
+      </w:pPr>
       <w:r>
         <w:t xml:space="preserve">1. Open target batch.</w:t>
       </w:r>
     </w:p>
     <w:p>
+      <w:pPr>
+        <w:spacing w:after="60"/>
+      </w:pPr>
       <w:r>
         <w:t xml:space="preserve">2. Click Create Print Job.</w:t>
       </w:r>
     </w:p>
     <w:p>
+      <w:pPr>
+        <w:spacing w:after="60"/>
+      </w:pPr>
       <w:r>
         <w:t xml:space="preserve">3. Enter quantity to print.</w:t>
       </w:r>
     </w:p>
     <w:p>
+      <w:pPr>
+        <w:spacing w:after="60"/>
+      </w:pPr>
       <w:r>
         <w:t xml:space="preserve">4. Submit.</w:t>
       </w:r>
@@ -1213,6 +1476,9 @@
       </w:r>
     </w:p>
     <w:p>
+      <w:pPr>
+        <w:spacing w:after="80"/>
+      </w:pPr>
       <w:r>
         <w:t xml:space="preserve">System behavior:</w:t>
       </w:r>
@@ -1224,6 +1490,7 @@
           <w:ilvl w:val="0"/>
           <w:numId w:val="1"/>
         </w:numPr>
+        <w:spacing w:after="60"/>
       </w:pPr>
       <w:r>
         <w:t xml:space="preserve">Server generates signed tokens for selected QR records.</w:t>
@@ -1236,6 +1503,7 @@
           <w:ilvl w:val="0"/>
           <w:numId w:val="1"/>
         </w:numPr>
+        <w:spacing w:after="60"/>
       </w:pPr>
       <w:r>
         <w:t xml:space="preserve">Batch reservation follows available unprinted QR count.</w:t>
@@ -1249,17 +1517,24 @@
     <w:p>
       <w:pPr>
         <w:pStyle w:val="Heading3"/>
+        <w:spacing w:before="180" w:after="80"/>
       </w:pPr>
       <w:r>
         <w:t xml:space="preserve">6.4 Download print pack</w:t>
       </w:r>
     </w:p>
     <w:p>
+      <w:pPr>
+        <w:spacing w:after="60"/>
+      </w:pPr>
       <w:r>
         <w:t xml:space="preserve">1. Click Download ZIP for created job.</w:t>
       </w:r>
     </w:p>
     <w:p>
+      <w:pPr>
+        <w:spacing w:after="60"/>
+      </w:pPr>
       <w:r>
         <w:t xml:space="preserve">2. Save and print labels.</w:t>
       </w:r>
@@ -1270,6 +1545,9 @@
       </w:r>
     </w:p>
     <w:p>
+      <w:pPr>
+        <w:spacing w:after="80"/>
+      </w:pPr>
       <w:r>
         <w:t xml:space="preserve">Security behavior:</w:t>
       </w:r>
@@ -1281,6 +1559,7 @@
           <w:ilvl w:val="0"/>
           <w:numId w:val="1"/>
         </w:numPr>
+        <w:spacing w:after="60"/>
       </w:pPr>
       <w:r>
         <w:t xml:space="preserve">Download is one-time for the same print job token.</w:t>
@@ -1293,6 +1572,7 @@
           <w:ilvl w:val="0"/>
           <w:numId w:val="1"/>
         </w:numPr>
+        <w:spacing w:after="60"/>
       </w:pPr>
       <w:r>
         <w:t xml:space="preserve">Server auto-confirms print state after successful download.</w:t>
@@ -1305,6 +1585,7 @@
           <w:ilvl w:val="0"/>
           <w:numId w:val="1"/>
         </w:numPr>
+        <w:spacing w:after="60"/>
       </w:pPr>
       <w:r>
         <w:t xml:space="preserve">Re-download attempt is blocked.</w:t>
@@ -1318,12 +1599,16 @@
     <w:p>
       <w:pPr>
         <w:pStyle w:val="Heading3"/>
+        <w:spacing w:before="180" w:after="80"/>
       </w:pPr>
       <w:r>
         <w:t xml:space="preserve">6.5 Print confirmation</w:t>
       </w:r>
     </w:p>
     <w:p>
+      <w:pPr>
+        <w:spacing w:after="80"/>
+      </w:pPr>
       <w:r>
         <w:t xml:space="preserve">Expected:</w:t>
       </w:r>
@@ -1335,6 +1620,7 @@
           <w:ilvl w:val="0"/>
           <w:numId w:val="1"/>
         </w:numPr>
+        <w:spacing w:after="60"/>
       </w:pPr>
       <w:r>
         <w:t xml:space="preserve">Batch/QR statuses update to printed automatically.</w:t>
@@ -1347,6 +1633,7 @@
           <w:ilvl w:val="0"/>
           <w:numId w:val="1"/>
         </w:numPr>
+        <w:spacing w:after="60"/>
       </w:pPr>
       <w:r>
         <w:t xml:space="preserve">No manual duplicate confirmation required in normal flow.</w:t>
@@ -1358,21 +1645,33 @@
       </w:r>
     </w:p>
     <w:p>
+      <w:pPr>
+        <w:spacing w:after="80"/>
+      </w:pPr>
       <w:r>
         <w:t xml:space="preserve">If status does not update:</w:t>
       </w:r>
     </w:p>
     <w:p>
+      <w:pPr>
+        <w:spacing w:after="60"/>
+      </w:pPr>
       <w:r>
         <w:t xml:space="preserve">1. Refresh page.</w:t>
       </w:r>
     </w:p>
     <w:p>
+      <w:pPr>
+        <w:spacing w:after="60"/>
+      </w:pPr>
       <w:r>
         <w:t xml:space="preserve">2. Check network/API connectivity.</w:t>
       </w:r>
     </w:p>
     <w:p>
+      <w:pPr>
+        <w:spacing w:after="60"/>
+      </w:pPr>
       <w:r>
         <w:t xml:space="preserve">3. Contact Licensee Admin with job ID and timestamp.</w:t>
       </w:r>
@@ -1385,6 +1684,7 @@
     <w:p>
       <w:pPr>
         <w:pStyle w:val="Heading2"/>
+        <w:spacing w:before="220" w:after="100"/>
       </w:pPr>
       <w:r>
         <w:t xml:space="preserve">7. Customer Verification (public verify page)</w:t>
@@ -1398,6 +1698,7 @@
     <w:p>
       <w:pPr>
         <w:pStyle w:val="Heading3"/>
+        <w:spacing w:before="180" w:after="80"/>
       </w:pPr>
       <w:r>
         <w:t xml:space="preserve">7.1 What the customer can do</w:t>
@@ -1410,6 +1711,7 @@
           <w:ilvl w:val="0"/>
           <w:numId w:val="1"/>
         </w:numPr>
+        <w:spacing w:after="60"/>
       </w:pPr>
       <w:r>
         <w:t xml:space="preserve">Verify authenticity by scanning a QR or entering the code manually.</w:t>
@@ -1422,6 +1724,7 @@
           <w:ilvl w:val="0"/>
           <w:numId w:val="1"/>
         </w:numPr>
+        <w:spacing w:after="60"/>
       </w:pPr>
       <w:r>
         <w:t xml:space="preserve">View brand/manufacturer and printed date (when available).</w:t>
@@ -1434,6 +1737,7 @@
           <w:ilvl w:val="0"/>
           <w:numId w:val="1"/>
         </w:numPr>
+        <w:spacing w:after="60"/>
       </w:pPr>
       <w:r>
         <w:t xml:space="preserve">View a scan history summary (counts and coarse location hints).</w:t>
@@ -1446,6 +1750,7 @@
           <w:ilvl w:val="0"/>
           <w:numId w:val="1"/>
         </w:numPr>
+        <w:spacing w:after="60"/>
       </w:pPr>
       <w:r>
         <w:t xml:space="preserve">Report suspected counterfeit with optional details and photos.</w:t>
@@ -1459,6 +1764,7 @@
     <w:p>
       <w:pPr>
         <w:pStyle w:val="Heading3"/>
+        <w:spacing w:before="180" w:after="80"/>
       </w:pPr>
       <w:r>
         <w:t xml:space="preserve">7.2 Result states (what they mean)</w:t>
@@ -1471,6 +1777,7 @@
           <w:ilvl w:val="0"/>
           <w:numId w:val="1"/>
         </w:numPr>
+        <w:spacing w:after="60"/>
       </w:pPr>
       <w:r>
         <w:t xml:space="preserve">Verified Authentic: first-time verification completed successfully.</w:t>
@@ -1483,6 +1790,7 @@
           <w:ilvl w:val="0"/>
           <w:numId w:val="1"/>
         </w:numPr>
+        <w:spacing w:after="60"/>
       </w:pPr>
       <w:r>
         <w:t xml:space="preserve">Verified Again: you verified this product before (repeat scans are normal).</w:t>
@@ -1495,6 +1803,7 @@
           <w:ilvl w:val="0"/>
           <w:numId w:val="1"/>
         </w:numPr>
+        <w:spacing w:after="60"/>
       </w:pPr>
       <w:r>
         <w:t xml:space="preserve">Possible Duplicate: security policy detected unusual scan patterns. Review before trusting.</w:t>
@@ -1507,6 +1816,7 @@
           <w:ilvl w:val="0"/>
           <w:numId w:val="1"/>
         </w:numPr>
+        <w:spacing w:after="60"/>
       </w:pPr>
       <w:r>
         <w:t xml:space="preserve">Under investigation: the brand/platform is investigating this item/batch/org. Follow support guidance.</w:t>
@@ -1519,6 +1829,7 @@
           <w:ilvl w:val="0"/>
           <w:numId w:val="1"/>
         </w:numPr>
+        <w:spacing w:after="60"/>
       </w:pPr>
       <w:r>
         <w:t xml:space="preserve">Blocked / Unassigned / Invalid: the code is blocked, not printed/assigned, or not recognized.</w:t>
@@ -1532,6 +1843,7 @@
     <w:p>
       <w:pPr>
         <w:pStyle w:val="Heading2"/>
+        <w:spacing w:before="220" w:after="100"/>
       </w:pPr>
       <w:r>
         <w:t xml:space="preserve">8. Incident Response (Super Admin SOP)</w:t>
@@ -1543,21 +1855,33 @@
       </w:r>
     </w:p>
     <w:p>
+      <w:pPr>
+        <w:spacing w:after="60"/>
+      </w:pPr>
       <w:r>
         <w:t xml:space="preserve">1. Open IR Center.</w:t>
       </w:r>
     </w:p>
     <w:p>
+      <w:pPr>
+        <w:spacing w:after="60"/>
+      </w:pPr>
       <w:r>
         <w:t xml:space="preserve">2. Review alerts (policy triggers) and open/assign incidents.</w:t>
       </w:r>
     </w:p>
     <w:p>
+      <w:pPr>
+        <w:spacing w:after="60"/>
+      </w:pPr>
       <w:r>
         <w:t xml:space="preserve">3. Add timeline notes for each decision.</w:t>
       </w:r>
     </w:p>
     <w:p>
+      <w:pPr>
+        <w:spacing w:after="60"/>
+      </w:pPr>
       <w:r>
         <w:t xml:space="preserve">4. Apply containment actions only when needed:</w:t>
       </w:r>
@@ -1569,6 +1893,7 @@
           <w:ilvl w:val="0"/>
           <w:numId w:val="1"/>
         </w:numPr>
+        <w:spacing w:after="60"/>
       </w:pPr>
       <w:r>
         <w:t xml:space="preserve">Flag QR under investigation</w:t>
@@ -1581,6 +1906,7 @@
           <w:ilvl w:val="0"/>
           <w:numId w:val="1"/>
         </w:numPr>
+        <w:spacing w:after="60"/>
       </w:pPr>
       <w:r>
         <w:t xml:space="preserve">Suspend batch</w:t>
@@ -1593,6 +1919,7 @@
           <w:ilvl w:val="0"/>
           <w:numId w:val="1"/>
         </w:numPr>
+        <w:spacing w:after="60"/>
       </w:pPr>
       <w:r>
         <w:t xml:space="preserve">Suspend manufacturer users</w:t>
@@ -1605,6 +1932,7 @@
           <w:ilvl w:val="0"/>
           <w:numId w:val="1"/>
         </w:numPr>
+        <w:spacing w:after="60"/>
       </w:pPr>
       <w:r>
         <w:t xml:space="preserve">Suspend org/licensee</w:t>
@@ -1617,12 +1945,16 @@
           <w:ilvl w:val="0"/>
           <w:numId w:val="1"/>
         </w:numPr>
+        <w:spacing w:after="60"/>
       </w:pPr>
       <w:r>
         <w:t xml:space="preserve">Reinstate with a reason when resolved</w:t>
       </w:r>
     </w:p>
     <w:p>
+      <w:pPr>
+        <w:spacing w:after="60"/>
+      </w:pPr>
       <w:r>
         <w:t xml:space="preserve">5. Use Communications to email reporters or org admins and keep messages logged.</w:t>
       </w:r>
@@ -1635,6 +1967,7 @@
     <w:p>
       <w:pPr>
         <w:pStyle w:val="Heading2"/>
+        <w:spacing w:before="220" w:after="100"/>
       </w:pPr>
       <w:r>
         <w:t xml:space="preserve">9. Operational SOP</w:t>
@@ -1646,26 +1979,41 @@
       </w:r>
     </w:p>
     <w:p>
+      <w:pPr>
+        <w:spacing w:after="80"/>
+      </w:pPr>
       <w:r>
         <w:t xml:space="preserve">Daily:</w:t>
       </w:r>
     </w:p>
     <w:p>
+      <w:pPr>
+        <w:spacing w:after="60"/>
+      </w:pPr>
       <w:r>
         <w:t xml:space="preserve">1. Licensee Admin reviews pending received inventory.</w:t>
       </w:r>
     </w:p>
     <w:p>
+      <w:pPr>
+        <w:spacing w:after="60"/>
+      </w:pPr>
       <w:r>
         <w:t xml:space="preserve">2. Licensee Admin assigns only required quantity to each manufacturer.</w:t>
       </w:r>
     </w:p>
     <w:p>
+      <w:pPr>
+        <w:spacing w:after="60"/>
+      </w:pPr>
       <w:r>
         <w:t xml:space="preserve">3. Manufacturer creates print jobs only for current production run.</w:t>
       </w:r>
     </w:p>
     <w:p>
+      <w:pPr>
+        <w:spacing w:after="60"/>
+      </w:pPr>
       <w:r>
         <w:t xml:space="preserve">4. Licensee Admin checks audit logs for unexpected batch events.</w:t>
       </w:r>
@@ -1676,21 +2024,33 @@
       </w:r>
     </w:p>
     <w:p>
+      <w:pPr>
+        <w:spacing w:after="80"/>
+      </w:pPr>
       <w:r>
         <w:t xml:space="preserve">Weekly:</w:t>
       </w:r>
     </w:p>
     <w:p>
+      <w:pPr>
+        <w:spacing w:after="60"/>
+      </w:pPr>
       <w:r>
         <w:t xml:space="preserve">1. Review printed vs assigned delta by manufacturer.</w:t>
       </w:r>
     </w:p>
     <w:p>
+      <w:pPr>
+        <w:spacing w:after="60"/>
+      </w:pPr>
       <w:r>
         <w:t xml:space="preserve">2. Investigate possible duplicate warnings and customer reports.</w:t>
       </w:r>
     </w:p>
     <w:p>
+      <w:pPr>
+        <w:spacing w:after="60"/>
+      </w:pPr>
       <w:r>
         <w:t xml:space="preserve">3. Deactivate unused manufacturer accounts.</w:t>
       </w:r>
@@ -1703,6 +2063,7 @@
     <w:p>
       <w:pPr>
         <w:pStyle w:val="Heading2"/>
+        <w:spacing w:before="220" w:after="100"/>
       </w:pPr>
       <w:r>
         <w:t xml:space="preserve">10. Troubleshooting</w:t>
@@ -1716,32 +2077,48 @@
     <w:p>
       <w:pPr>
         <w:pStyle w:val="Heading3"/>
+        <w:spacing w:before="180" w:after="80"/>
       </w:pPr>
       <w:r>
         <w:t xml:space="preserve">Issue: Manufacturers list is empty</w:t>
       </w:r>
     </w:p>
     <w:p>
+      <w:pPr>
+        <w:spacing w:after="80"/>
+      </w:pPr>
       <w:r>
         <w:t xml:space="preserve">Checks:</w:t>
       </w:r>
     </w:p>
     <w:p>
+      <w:pPr>
+        <w:spacing w:after="60"/>
+      </w:pPr>
       <w:r>
         <w:t xml:space="preserve">1. Confirm logged-in user is linked to a licensee.</w:t>
       </w:r>
     </w:p>
     <w:p>
+      <w:pPr>
+        <w:spacing w:after="60"/>
+      </w:pPr>
       <w:r>
         <w:t xml:space="preserve">2. Ensure at least one manufacturer exists under that licensee.</w:t>
       </w:r>
     </w:p>
     <w:p>
+      <w:pPr>
+        <w:spacing w:after="60"/>
+      </w:pPr>
       <w:r>
         <w:t xml:space="preserve">3. Toggle active/all status.</w:t>
       </w:r>
     </w:p>
     <w:p>
+      <w:pPr>
+        <w:spacing w:after="60"/>
+      </w:pPr>
       <w:r>
         <w:t xml:space="preserve">4. Reload page and retry.</w:t>
       </w:r>
@@ -1754,27 +2131,40 @@
     <w:p>
       <w:pPr>
         <w:pStyle w:val="Heading3"/>
+        <w:spacing w:before="180" w:after="80"/>
       </w:pPr>
       <w:r>
         <w:t xml:space="preserve">Issue: Batch assignment says insufficient available quantity</w:t>
       </w:r>
     </w:p>
     <w:p>
+      <w:pPr>
+        <w:spacing w:after="80"/>
+      </w:pPr>
       <w:r>
         <w:t xml:space="preserve">Checks:</w:t>
       </w:r>
     </w:p>
     <w:p>
+      <w:pPr>
+        <w:spacing w:after="60"/>
+      </w:pPr>
       <w:r>
         <w:t xml:space="preserve">1. Ensure source batch still has unassigned inventory.</w:t>
       </w:r>
     </w:p>
     <w:p>
+      <w:pPr>
+        <w:spacing w:after="60"/>
+      </w:pPr>
       <w:r>
         <w:t xml:space="preserve">2. Reduce quantity and retry.</w:t>
       </w:r>
     </w:p>
     <w:p>
+      <w:pPr>
+        <w:spacing w:after="60"/>
+      </w:pPr>
       <w:r>
         <w:t xml:space="preserve">3. Refresh to sync latest allocation state.</w:t>
       </w:r>
@@ -1787,27 +2177,40 @@
     <w:p>
       <w:pPr>
         <w:pStyle w:val="Heading3"/>
+        <w:spacing w:before="180" w:after="80"/>
       </w:pPr>
       <w:r>
         <w:t xml:space="preserve">Issue: Print job fails</w:t>
       </w:r>
     </w:p>
     <w:p>
+      <w:pPr>
+        <w:spacing w:after="80"/>
+      </w:pPr>
       <w:r>
         <w:t xml:space="preserve">Checks:</w:t>
       </w:r>
     </w:p>
     <w:p>
+      <w:pPr>
+        <w:spacing w:after="60"/>
+      </w:pPr>
       <w:r>
         <w:t xml:space="preserve">1. Verify batch belongs to current manufacturer.</w:t>
       </w:r>
     </w:p>
     <w:p>
+      <w:pPr>
+        <w:spacing w:after="60"/>
+      </w:pPr>
       <w:r>
         <w:t xml:space="preserve">2. Confirm requested quantity does not exceed available unprinted codes.</w:t>
       </w:r>
     </w:p>
     <w:p>
+      <w:pPr>
+        <w:spacing w:after="60"/>
+      </w:pPr>
       <w:r>
         <w:t xml:space="preserve">3. Retry if server reports batch busy/concurrency.</w:t>
       </w:r>
@@ -1820,12 +2223,16 @@
     <w:p>
       <w:pPr>
         <w:pStyle w:val="Heading3"/>
+        <w:spacing w:before="180" w:after="80"/>
       </w:pPr>
       <w:r>
         <w:t xml:space="preserve">Issue: Verify page shows “Possible Duplicate”</w:t>
       </w:r>
     </w:p>
     <w:p>
+      <w:pPr>
+        <w:spacing w:after="80"/>
+      </w:pPr>
       <w:r>
         <w:t xml:space="preserve">Meaning:</w:t>
       </w:r>
@@ -1837,6 +2244,7 @@
           <w:ilvl w:val="0"/>
           <w:numId w:val="1"/>
         </w:numPr>
+        <w:spacing w:after="60"/>
       </w:pPr>
       <w:r>
         <w:t xml:space="preserve">The same QR shows scan patterns that do not match normal buyer behavior.</w:t>
@@ -1849,6 +2257,7 @@
           <w:ilvl w:val="0"/>
           <w:numId w:val="1"/>
         </w:numPr>
+        <w:spacing w:after="60"/>
       </w:pPr>
       <w:r>
         <w:t xml:space="preserve">This can indicate copied labels on multiple items.</w:t>
@@ -1860,6 +2269,9 @@
       </w:r>
     </w:p>
     <w:p>
+      <w:pPr>
+        <w:spacing w:after="80"/>
+      </w:pPr>
       <w:r>
         <w:t xml:space="preserve">What to do:</w:t>
       </w:r>
@@ -1871,6 +2283,7 @@
           <w:ilvl w:val="0"/>
           <w:numId w:val="1"/>
         </w:numPr>
+        <w:spacing w:after="60"/>
       </w:pPr>
       <w:r>
         <w:t xml:space="preserve">Review “Why this was flagged”.</w:t>
@@ -1883,6 +2296,7 @@
           <w:ilvl w:val="0"/>
           <w:numId w:val="1"/>
         </w:numPr>
+        <w:spacing w:after="60"/>
       </w:pPr>
       <w:r>
         <w:t xml:space="preserve">Use “Report suspected counterfeit” if you suspect fraud.</w:t>
@@ -1896,6 +2310,7 @@
     <w:p>
       <w:pPr>
         <w:pStyle w:val="Heading2"/>
+        <w:spacing w:before="220" w:after="100"/>
       </w:pPr>
       <w:r>
         <w:t xml:space="preserve">11. Security Compliance Notes</w:t>
@@ -1907,6 +2322,9 @@
       </w:r>
     </w:p>
     <w:p>
+      <w:pPr>
+        <w:spacing w:after="80"/>
+      </w:pPr>
       <w:r>
         <w:t xml:space="preserve">Implemented controls:</w:t>
       </w:r>
@@ -1918,6 +2336,7 @@
           <w:ilvl w:val="0"/>
           <w:numId w:val="1"/>
         </w:numPr>
+        <w:spacing w:after="60"/>
       </w:pPr>
       <w:r>
         <w:t xml:space="preserve">Signed QR token validation.</w:t>
@@ -1930,6 +2349,7 @@
           <w:ilvl w:val="0"/>
           <w:numId w:val="1"/>
         </w:numPr>
+        <w:spacing w:after="60"/>
       </w:pPr>
       <w:r>
         <w:t xml:space="preserve">Server-side state transitions and audit logging.</w:t>
@@ -1942,6 +2362,7 @@
           <w:ilvl w:val="0"/>
           <w:numId w:val="1"/>
         </w:numPr>
+        <w:spacing w:after="60"/>
       </w:pPr>
       <w:r>
         <w:t xml:space="preserve">Print job lock and one-time download behavior.</w:t>
@@ -1954,6 +2375,7 @@
           <w:ilvl w:val="0"/>
           <w:numId w:val="1"/>
         </w:numPr>
+        <w:spacing w:after="60"/>
       </w:pPr>
       <w:r>
         <w:t xml:space="preserve">Rate limiting and scan metadata tracking.</w:t>
@@ -1966,6 +2388,7 @@
           <w:ilvl w:val="0"/>
           <w:numId w:val="1"/>
         </w:numPr>
+        <w:spacing w:after="60"/>
       </w:pPr>
       <w:r>
         <w:t xml:space="preserve">Cookie-based sessions (HttpOnly) for admin/manufacturer access.</w:t>
@@ -1978,6 +2401,7 @@
           <w:ilvl w:val="0"/>
           <w:numId w:val="1"/>
         </w:numPr>
+        <w:spacing w:after="60"/>
       </w:pPr>
       <w:r>
         <w:t xml:space="preserve">Invite-based onboarding with single-use tokens.</w:t>
@@ -1990,6 +2414,7 @@
           <w:ilvl w:val="0"/>
           <w:numId w:val="1"/>
         </w:numPr>
+        <w:spacing w:after="60"/>
       </w:pPr>
       <w:r>
         <w:t xml:space="preserve">Refresh token rotation with reuse detection.</w:t>
@@ -2002,6 +2427,7 @@
           <w:ilvl w:val="0"/>
           <w:numId w:val="1"/>
         </w:numPr>
+        <w:spacing w:after="60"/>
       </w:pPr>
       <w:r>
         <w:t xml:space="preserve">CSRF protection for cookie-authenticated state-changing requests.</w:t>
@@ -2014,6 +2440,7 @@
           <w:ilvl w:val="0"/>
           <w:numId w:val="1"/>
         </w:numPr>
+        <w:spacing w:after="60"/>
       </w:pPr>
       <w:r>
         <w:t xml:space="preserve">IR containment actions and communications logging.</w:t>
@@ -2025,6 +2452,9 @@
       </w:r>
     </w:p>
     <w:p>
+      <w:pPr>
+        <w:spacing w:after="80"/>
+      </w:pPr>
       <w:r>
         <w:t xml:space="preserve">Operational caveat:</w:t>
       </w:r>
@@ -2036,6 +2466,7 @@
           <w:ilvl w:val="0"/>
           <w:numId w:val="1"/>
         </w:numPr>
+        <w:spacing w:after="60"/>
       </w:pPr>
       <w:r>
         <w:t xml:space="preserve">Physical image copying cannot be prevented absolutely.</w:t>
@@ -2048,6 +2479,7 @@
           <w:ilvl w:val="0"/>
           <w:numId w:val="1"/>
         </w:numPr>
+        <w:spacing w:after="60"/>
       </w:pPr>
       <w:r>
         <w:t xml:space="preserve">System detects and flags reuse so duplicates cannot be validated repeatedly.</w:t>
@@ -2061,6 +2493,7 @@
     <w:p>
       <w:pPr>
         <w:pStyle w:val="Heading2"/>
+        <w:spacing w:before="220" w:after="100"/>
       </w:pPr>
       <w:r>
         <w:t xml:space="preserve">12. Escalation Matrix</w:t>
@@ -2072,16 +2505,25 @@
       </w:r>
     </w:p>
     <w:p>
+      <w:pPr>
+        <w:spacing w:after="60"/>
+      </w:pPr>
       <w:r>
         <w:t xml:space="preserve">1. Manufacturer operation issue: contact Licensee Admin.</w:t>
       </w:r>
     </w:p>
     <w:p>
+      <w:pPr>
+        <w:spacing w:after="60"/>
+      </w:pPr>
       <w:r>
         <w:t xml:space="preserve">2. Cross-tenant, account, or policy issue: escalate to Super Admin.</w:t>
       </w:r>
     </w:p>
     <w:p>
+      <w:pPr>
+        <w:spacing w:after="60"/>
+      </w:pPr>
       <w:r>
         <w:t xml:space="preserve">3. Persistent API failures: collect timestamp, user ID/email, batch/job ID, and request path for investigation.</w:t>
       </w:r>
@@ -2094,12 +2536,16 @@
     <w:p>
       <w:pPr>
         <w:pStyle w:val="Heading2"/>
+        <w:spacing w:before="220" w:after="100"/>
       </w:pPr>
       <w:r>
         <w:t xml:space="preserve">Appendix A — Screenshots (reference)</w:t>
       </w:r>
     </w:p>
     <w:p>
+      <w:pPr>
+        <w:spacing w:after="80"/>
+      </w:pPr>
       <w:r>
         <w:t xml:space="preserve">Screenshots used in the in-app Help Center live in public/docs/.</w:t>
       </w:r>
@@ -2112,29 +2558,258 @@
     <w:p>
       <w:pPr>
         <w:pStyle w:val="Heading3"/>
+        <w:spacing w:before="180" w:after="80"/>
       </w:pPr>
       <w:r>
         <w:t xml:space="preserve">Customer verify outcomes</w:t>
       </w:r>
     </w:p>
     <w:p>
-      <w:r>
-        <w:t xml:space="preserve">Screenshot: Customer - Verified Authentic (../public/docs/customer-first-verification.png)</w:t>
-      </w:r>
-    </w:p>
-    <w:p>
-      <w:r>
-        <w:t xml:space="preserve">Screenshot: Customer - Verified Again (../public/docs/customer-verified-again.png)</w:t>
-      </w:r>
-    </w:p>
-    <w:p>
-      <w:r>
-        <w:t xml:space="preserve">Screenshot: Customer - Possible Duplicate (../public/docs/customer-possible-duplicate.png)</w:t>
-      </w:r>
-    </w:p>
-    <w:p>
-      <w:r>
-        <w:t xml:space="preserve">Screenshot: Customer - Report dialog (../public/docs/customer-report-dialog.png)</w:t>
+      <w:pPr>
+        <w:spacing w:before="120" w:after="80"/>
+        <w:jc w:val="center"/>
+      </w:pPr>
+      <w:r>
+        <w:drawing>
+          <wp:inline distT="0" distB="0" distL="0" distR="0">
+            <wp:extent cx="5429250" cy="3619500"/>
+            <wp:effectExtent t="0" r="0" b="0" l="0"/>
+            <wp:docPr id="1" name="" descr="" title=""/>
+            <wp:cNvGraphicFramePr>
+              <a:graphicFrameLocks xmlns:a="http://schemas.openxmlformats.org/drawingml/2006/main" noChangeAspect="1"/>
+            </wp:cNvGraphicFramePr>
+            <a:graphic xmlns:a="http://schemas.openxmlformats.org/drawingml/2006/main">
+              <a:graphicData uri="http://schemas.openxmlformats.org/drawingml/2006/picture">
+                <pic:pic xmlns:pic="http://schemas.openxmlformats.org/drawingml/2006/picture">
+                  <pic:nvPicPr>
+                    <pic:cNvPr id="0" name="" descr=""/>
+                    <pic:cNvPicPr>
+                      <a:picLocks noChangeAspect="1" noChangeArrowheads="1"/>
+                    </pic:cNvPicPr>
+                  </pic:nvPicPr>
+                  <pic:blipFill>
+                    <a:blip r:embed="rId6" cstate="none"/>
+                    <a:srcRect/>
+                    <a:stretch>
+                      <a:fillRect/>
+                    </a:stretch>
+                  </pic:blipFill>
+                  <pic:spPr bwMode="auto">
+                    <a:xfrm>
+                      <a:off x="0" y="0"/>
+                      <a:ext cx="5429250" cy="3619500"/>
+                    </a:xfrm>
+                    <a:prstGeom prst="rect">
+                      <a:avLst/>
+                    </a:prstGeom>
+                  </pic:spPr>
+                </pic:pic>
+              </a:graphicData>
+            </a:graphic>
+          </wp:inline>
+        </w:drawing>
+      </w:r>
+    </w:p>
+    <w:p>
+      <w:pPr>
+        <w:spacing w:after="220"/>
+        <w:jc w:val="center"/>
+      </w:pPr>
+      <w:r>
+        <w:rPr>
+          <w:i/>
+          <w:iCs/>
+          <w:color w:val="4b5563"/>
+          <w:sz w:val="20"/>
+          <w:szCs w:val="20"/>
+        </w:rPr>
+        <w:t xml:space="preserve">Customer - Verified Authentic</w:t>
+      </w:r>
+    </w:p>
+    <w:p>
+      <w:pPr>
+        <w:spacing w:before="120" w:after="80"/>
+        <w:jc w:val="center"/>
+      </w:pPr>
+      <w:r>
+        <w:drawing>
+          <wp:inline distT="0" distB="0" distL="0" distR="0">
+            <wp:extent cx="5429250" cy="3619500"/>
+            <wp:effectExtent t="0" r="0" b="0" l="0"/>
+            <wp:docPr id="1" name="" descr="" title=""/>
+            <wp:cNvGraphicFramePr>
+              <a:graphicFrameLocks xmlns:a="http://schemas.openxmlformats.org/drawingml/2006/main" noChangeAspect="1"/>
+            </wp:cNvGraphicFramePr>
+            <a:graphic xmlns:a="http://schemas.openxmlformats.org/drawingml/2006/main">
+              <a:graphicData uri="http://schemas.openxmlformats.org/drawingml/2006/picture">
+                <pic:pic xmlns:pic="http://schemas.openxmlformats.org/drawingml/2006/picture">
+                  <pic:nvPicPr>
+                    <pic:cNvPr id="0" name="" descr=""/>
+                    <pic:cNvPicPr>
+                      <a:picLocks noChangeAspect="1" noChangeArrowheads="1"/>
+                    </pic:cNvPicPr>
+                  </pic:nvPicPr>
+                  <pic:blipFill>
+                    <a:blip r:embed="rId7" cstate="none"/>
+                    <a:srcRect/>
+                    <a:stretch>
+                      <a:fillRect/>
+                    </a:stretch>
+                  </pic:blipFill>
+                  <pic:spPr bwMode="auto">
+                    <a:xfrm>
+                      <a:off x="0" y="0"/>
+                      <a:ext cx="5429250" cy="3619500"/>
+                    </a:xfrm>
+                    <a:prstGeom prst="rect">
+                      <a:avLst/>
+                    </a:prstGeom>
+                  </pic:spPr>
+                </pic:pic>
+              </a:graphicData>
+            </a:graphic>
+          </wp:inline>
+        </w:drawing>
+      </w:r>
+    </w:p>
+    <w:p>
+      <w:pPr>
+        <w:spacing w:after="220"/>
+        <w:jc w:val="center"/>
+      </w:pPr>
+      <w:r>
+        <w:rPr>
+          <w:i/>
+          <w:iCs/>
+          <w:color w:val="4b5563"/>
+          <w:sz w:val="20"/>
+          <w:szCs w:val="20"/>
+        </w:rPr>
+        <w:t xml:space="preserve">Customer - Verified Again</w:t>
+      </w:r>
+    </w:p>
+    <w:p>
+      <w:pPr>
+        <w:spacing w:before="120" w:after="80"/>
+        <w:jc w:val="center"/>
+      </w:pPr>
+      <w:r>
+        <w:drawing>
+          <wp:inline distT="0" distB="0" distL="0" distR="0">
+            <wp:extent cx="5429250" cy="3619500"/>
+            <wp:effectExtent t="0" r="0" b="0" l="0"/>
+            <wp:docPr id="1" name="" descr="" title=""/>
+            <wp:cNvGraphicFramePr>
+              <a:graphicFrameLocks xmlns:a="http://schemas.openxmlformats.org/drawingml/2006/main" noChangeAspect="1"/>
+            </wp:cNvGraphicFramePr>
+            <a:graphic xmlns:a="http://schemas.openxmlformats.org/drawingml/2006/main">
+              <a:graphicData uri="http://schemas.openxmlformats.org/drawingml/2006/picture">
+                <pic:pic xmlns:pic="http://schemas.openxmlformats.org/drawingml/2006/picture">
+                  <pic:nvPicPr>
+                    <pic:cNvPr id="0" name="" descr=""/>
+                    <pic:cNvPicPr>
+                      <a:picLocks noChangeAspect="1" noChangeArrowheads="1"/>
+                    </pic:cNvPicPr>
+                  </pic:nvPicPr>
+                  <pic:blipFill>
+                    <a:blip r:embed="rId8" cstate="none"/>
+                    <a:srcRect/>
+                    <a:stretch>
+                      <a:fillRect/>
+                    </a:stretch>
+                  </pic:blipFill>
+                  <pic:spPr bwMode="auto">
+                    <a:xfrm>
+                      <a:off x="0" y="0"/>
+                      <a:ext cx="5429250" cy="3619500"/>
+                    </a:xfrm>
+                    <a:prstGeom prst="rect">
+                      <a:avLst/>
+                    </a:prstGeom>
+                  </pic:spPr>
+                </pic:pic>
+              </a:graphicData>
+            </a:graphic>
+          </wp:inline>
+        </w:drawing>
+      </w:r>
+    </w:p>
+    <w:p>
+      <w:pPr>
+        <w:spacing w:after="220"/>
+        <w:jc w:val="center"/>
+      </w:pPr>
+      <w:r>
+        <w:rPr>
+          <w:i/>
+          <w:iCs/>
+          <w:color w:val="4b5563"/>
+          <w:sz w:val="20"/>
+          <w:szCs w:val="20"/>
+        </w:rPr>
+        <w:t xml:space="preserve">Customer - Possible Duplicate</w:t>
+      </w:r>
+    </w:p>
+    <w:p>
+      <w:pPr>
+        <w:spacing w:before="120" w:after="80"/>
+        <w:jc w:val="center"/>
+      </w:pPr>
+      <w:r>
+        <w:drawing>
+          <wp:inline distT="0" distB="0" distL="0" distR="0">
+            <wp:extent cx="5429250" cy="3619500"/>
+            <wp:effectExtent t="0" r="0" b="0" l="0"/>
+            <wp:docPr id="1" name="" descr="" title=""/>
+            <wp:cNvGraphicFramePr>
+              <a:graphicFrameLocks xmlns:a="http://schemas.openxmlformats.org/drawingml/2006/main" noChangeAspect="1"/>
+            </wp:cNvGraphicFramePr>
+            <a:graphic xmlns:a="http://schemas.openxmlformats.org/drawingml/2006/main">
+              <a:graphicData uri="http://schemas.openxmlformats.org/drawingml/2006/picture">
+                <pic:pic xmlns:pic="http://schemas.openxmlformats.org/drawingml/2006/picture">
+                  <pic:nvPicPr>
+                    <pic:cNvPr id="0" name="" descr=""/>
+                    <pic:cNvPicPr>
+                      <a:picLocks noChangeAspect="1" noChangeArrowheads="1"/>
+                    </pic:cNvPicPr>
+                  </pic:nvPicPr>
+                  <pic:blipFill>
+                    <a:blip r:embed="rId9" cstate="none"/>
+                    <a:srcRect/>
+                    <a:stretch>
+                      <a:fillRect/>
+                    </a:stretch>
+                  </pic:blipFill>
+                  <pic:spPr bwMode="auto">
+                    <a:xfrm>
+                      <a:off x="0" y="0"/>
+                      <a:ext cx="5429250" cy="3619500"/>
+                    </a:xfrm>
+                    <a:prstGeom prst="rect">
+                      <a:avLst/>
+                    </a:prstGeom>
+                  </pic:spPr>
+                </pic:pic>
+              </a:graphicData>
+            </a:graphic>
+          </wp:inline>
+        </w:drawing>
+      </w:r>
+    </w:p>
+    <w:p>
+      <w:pPr>
+        <w:spacing w:after="220"/>
+        <w:jc w:val="center"/>
+      </w:pPr>
+      <w:r>
+        <w:rPr>
+          <w:i/>
+          <w:iCs/>
+          <w:color w:val="4b5563"/>
+          <w:sz w:val="20"/>
+          <w:szCs w:val="20"/>
+        </w:rPr>
+        <w:t xml:space="preserve">Customer - Report dialog</w:t>
       </w:r>
     </w:p>
     <w:p>
@@ -2145,29 +2820,258 @@
     <w:p>
       <w:pPr>
         <w:pStyle w:val="Heading3"/>
+        <w:spacing w:before="180" w:after="80"/>
       </w:pPr>
       <w:r>
         <w:t xml:space="preserve">Admin operations</w:t>
       </w:r>
     </w:p>
     <w:p>
-      <w:r>
-        <w:t xml:space="preserve">Screenshot: Super Admin - Create licensee (../public/docs/superadmin-create-licensee.png)</w:t>
-      </w:r>
-    </w:p>
-    <w:p>
-      <w:r>
-        <w:t xml:space="preserve">Screenshot: Super Admin - Approve QR request (../public/docs/superadmin-approve-qr-request.png)</w:t>
-      </w:r>
-    </w:p>
-    <w:p>
-      <w:r>
-        <w:t xml:space="preserve">Screenshot: Manufacturer - Create print job (../public/docs/manufacturer-create-print-job.png)</w:t>
-      </w:r>
-    </w:p>
-    <w:p>
-      <w:r>
-        <w:t xml:space="preserve">Screenshot: IR Center (../public/docs/ir-dashboard.png)</w:t>
+      <w:pPr>
+        <w:spacing w:before="120" w:after="80"/>
+        <w:jc w:val="center"/>
+      </w:pPr>
+      <w:r>
+        <w:drawing>
+          <wp:inline distT="0" distB="0" distL="0" distR="0">
+            <wp:extent cx="5905500" cy="3228975"/>
+            <wp:effectExtent t="0" r="0" b="0" l="0"/>
+            <wp:docPr id="1" name="" descr="" title=""/>
+            <wp:cNvGraphicFramePr>
+              <a:graphicFrameLocks xmlns:a="http://schemas.openxmlformats.org/drawingml/2006/main" noChangeAspect="1"/>
+            </wp:cNvGraphicFramePr>
+            <a:graphic xmlns:a="http://schemas.openxmlformats.org/drawingml/2006/main">
+              <a:graphicData uri="http://schemas.openxmlformats.org/drawingml/2006/picture">
+                <pic:pic xmlns:pic="http://schemas.openxmlformats.org/drawingml/2006/picture">
+                  <pic:nvPicPr>
+                    <pic:cNvPr id="0" name="" descr=""/>
+                    <pic:cNvPicPr>
+                      <a:picLocks noChangeAspect="1" noChangeArrowheads="1"/>
+                    </pic:cNvPicPr>
+                  </pic:nvPicPr>
+                  <pic:blipFill>
+                    <a:blip r:embed="rId10" cstate="none"/>
+                    <a:srcRect/>
+                    <a:stretch>
+                      <a:fillRect/>
+                    </a:stretch>
+                  </pic:blipFill>
+                  <pic:spPr bwMode="auto">
+                    <a:xfrm>
+                      <a:off x="0" y="0"/>
+                      <a:ext cx="5905500" cy="3228975"/>
+                    </a:xfrm>
+                    <a:prstGeom prst="rect">
+                      <a:avLst/>
+                    </a:prstGeom>
+                  </pic:spPr>
+                </pic:pic>
+              </a:graphicData>
+            </a:graphic>
+          </wp:inline>
+        </w:drawing>
+      </w:r>
+    </w:p>
+    <w:p>
+      <w:pPr>
+        <w:spacing w:after="220"/>
+        <w:jc w:val="center"/>
+      </w:pPr>
+      <w:r>
+        <w:rPr>
+          <w:i/>
+          <w:iCs/>
+          <w:color w:val="4b5563"/>
+          <w:sz w:val="20"/>
+          <w:szCs w:val="20"/>
+        </w:rPr>
+        <w:t xml:space="preserve">Super Admin - Create licensee</w:t>
+      </w:r>
+    </w:p>
+    <w:p>
+      <w:pPr>
+        <w:spacing w:before="120" w:after="80"/>
+        <w:jc w:val="center"/>
+      </w:pPr>
+      <w:r>
+        <w:drawing>
+          <wp:inline distT="0" distB="0" distL="0" distR="0">
+            <wp:extent cx="5905500" cy="3228975"/>
+            <wp:effectExtent t="0" r="0" b="0" l="0"/>
+            <wp:docPr id="1" name="" descr="" title=""/>
+            <wp:cNvGraphicFramePr>
+              <a:graphicFrameLocks xmlns:a="http://schemas.openxmlformats.org/drawingml/2006/main" noChangeAspect="1"/>
+            </wp:cNvGraphicFramePr>
+            <a:graphic xmlns:a="http://schemas.openxmlformats.org/drawingml/2006/main">
+              <a:graphicData uri="http://schemas.openxmlformats.org/drawingml/2006/picture">
+                <pic:pic xmlns:pic="http://schemas.openxmlformats.org/drawingml/2006/picture">
+                  <pic:nvPicPr>
+                    <pic:cNvPr id="0" name="" descr=""/>
+                    <pic:cNvPicPr>
+                      <a:picLocks noChangeAspect="1" noChangeArrowheads="1"/>
+                    </pic:cNvPicPr>
+                  </pic:nvPicPr>
+                  <pic:blipFill>
+                    <a:blip r:embed="rId11" cstate="none"/>
+                    <a:srcRect/>
+                    <a:stretch>
+                      <a:fillRect/>
+                    </a:stretch>
+                  </pic:blipFill>
+                  <pic:spPr bwMode="auto">
+                    <a:xfrm>
+                      <a:off x="0" y="0"/>
+                      <a:ext cx="5905500" cy="3228975"/>
+                    </a:xfrm>
+                    <a:prstGeom prst="rect">
+                      <a:avLst/>
+                    </a:prstGeom>
+                  </pic:spPr>
+                </pic:pic>
+              </a:graphicData>
+            </a:graphic>
+          </wp:inline>
+        </w:drawing>
+      </w:r>
+    </w:p>
+    <w:p>
+      <w:pPr>
+        <w:spacing w:after="220"/>
+        <w:jc w:val="center"/>
+      </w:pPr>
+      <w:r>
+        <w:rPr>
+          <w:i/>
+          <w:iCs/>
+          <w:color w:val="4b5563"/>
+          <w:sz w:val="20"/>
+          <w:szCs w:val="20"/>
+        </w:rPr>
+        <w:t xml:space="preserve">Super Admin - Approve QR request</w:t>
+      </w:r>
+    </w:p>
+    <w:p>
+      <w:pPr>
+        <w:spacing w:before="120" w:after="80"/>
+        <w:jc w:val="center"/>
+      </w:pPr>
+      <w:r>
+        <w:drawing>
+          <wp:inline distT="0" distB="0" distL="0" distR="0">
+            <wp:extent cx="5905500" cy="3228975"/>
+            <wp:effectExtent t="0" r="0" b="0" l="0"/>
+            <wp:docPr id="1" name="" descr="" title=""/>
+            <wp:cNvGraphicFramePr>
+              <a:graphicFrameLocks xmlns:a="http://schemas.openxmlformats.org/drawingml/2006/main" noChangeAspect="1"/>
+            </wp:cNvGraphicFramePr>
+            <a:graphic xmlns:a="http://schemas.openxmlformats.org/drawingml/2006/main">
+              <a:graphicData uri="http://schemas.openxmlformats.org/drawingml/2006/picture">
+                <pic:pic xmlns:pic="http://schemas.openxmlformats.org/drawingml/2006/picture">
+                  <pic:nvPicPr>
+                    <pic:cNvPr id="0" name="" descr=""/>
+                    <pic:cNvPicPr>
+                      <a:picLocks noChangeAspect="1" noChangeArrowheads="1"/>
+                    </pic:cNvPicPr>
+                  </pic:nvPicPr>
+                  <pic:blipFill>
+                    <a:blip r:embed="rId12" cstate="none"/>
+                    <a:srcRect/>
+                    <a:stretch>
+                      <a:fillRect/>
+                    </a:stretch>
+                  </pic:blipFill>
+                  <pic:spPr bwMode="auto">
+                    <a:xfrm>
+                      <a:off x="0" y="0"/>
+                      <a:ext cx="5905500" cy="3228975"/>
+                    </a:xfrm>
+                    <a:prstGeom prst="rect">
+                      <a:avLst/>
+                    </a:prstGeom>
+                  </pic:spPr>
+                </pic:pic>
+              </a:graphicData>
+            </a:graphic>
+          </wp:inline>
+        </w:drawing>
+      </w:r>
+    </w:p>
+    <w:p>
+      <w:pPr>
+        <w:spacing w:after="220"/>
+        <w:jc w:val="center"/>
+      </w:pPr>
+      <w:r>
+        <w:rPr>
+          <w:i/>
+          <w:iCs/>
+          <w:color w:val="4b5563"/>
+          <w:sz w:val="20"/>
+          <w:szCs w:val="20"/>
+        </w:rPr>
+        <w:t xml:space="preserve">Manufacturer - Create print job</w:t>
+      </w:r>
+    </w:p>
+    <w:p>
+      <w:pPr>
+        <w:spacing w:before="120" w:after="80"/>
+        <w:jc w:val="center"/>
+      </w:pPr>
+      <w:r>
+        <w:drawing>
+          <wp:inline distT="0" distB="0" distL="0" distR="0">
+            <wp:extent cx="5905500" cy="3228975"/>
+            <wp:effectExtent t="0" r="0" b="0" l="0"/>
+            <wp:docPr id="1" name="" descr="" title=""/>
+            <wp:cNvGraphicFramePr>
+              <a:graphicFrameLocks xmlns:a="http://schemas.openxmlformats.org/drawingml/2006/main" noChangeAspect="1"/>
+            </wp:cNvGraphicFramePr>
+            <a:graphic xmlns:a="http://schemas.openxmlformats.org/drawingml/2006/main">
+              <a:graphicData uri="http://schemas.openxmlformats.org/drawingml/2006/picture">
+                <pic:pic xmlns:pic="http://schemas.openxmlformats.org/drawingml/2006/picture">
+                  <pic:nvPicPr>
+                    <pic:cNvPr id="0" name="" descr=""/>
+                    <pic:cNvPicPr>
+                      <a:picLocks noChangeAspect="1" noChangeArrowheads="1"/>
+                    </pic:cNvPicPr>
+                  </pic:nvPicPr>
+                  <pic:blipFill>
+                    <a:blip r:embed="rId13" cstate="none"/>
+                    <a:srcRect/>
+                    <a:stretch>
+                      <a:fillRect/>
+                    </a:stretch>
+                  </pic:blipFill>
+                  <pic:spPr bwMode="auto">
+                    <a:xfrm>
+                      <a:off x="0" y="0"/>
+                      <a:ext cx="5905500" cy="3228975"/>
+                    </a:xfrm>
+                    <a:prstGeom prst="rect">
+                      <a:avLst/>
+                    </a:prstGeom>
+                  </pic:spPr>
+                </pic:pic>
+              </a:graphicData>
+            </a:graphic>
+          </wp:inline>
+        </w:drawing>
+      </w:r>
+    </w:p>
+    <w:p>
+      <w:pPr>
+        <w:spacing w:after="220"/>
+        <w:jc w:val="center"/>
+      </w:pPr>
+      <w:r>
+        <w:rPr>
+          <w:i/>
+          <w:iCs/>
+          <w:color w:val="4b5563"/>
+          <w:sz w:val="20"/>
+          <w:szCs w:val="20"/>
+        </w:rPr>
+        <w:t xml:space="preserve">IR Center</w:t>
       </w:r>
     </w:p>
     <w:p>

</xml_diff>